<commit_message>
Notifica per fascia di prezzo e vendita, lista marche curata
- Avviso ha ora tre traguardi indipendenti: soglia esatta, fascia di
  mille che la contiene, e vendita dell'auto (nuovo AutoVendutaEvent),
  ciascuno con il proprio segno "gia' inviato" e la propria mail
- Frontend (Avvisi.jsx, AdminAuto.jsx) riflette i nuovi stati e avvisa
  l'admin prima di segnare un'auto come venduta
- Aggiunta una lista di marche curata (fe/src/lib/marcheNote.js) come
  suggerimento nel form "Nuova marca", al posto di un'API esterna:
  verificato che i registri gratuiti disponibili (es. NHTSA vPIC) sono
  americani e non coprono marche europee comuni
- README e ANALISI.docx aggiornati con le nuove scelte; corrette alcune
  inesattezze del modello dati rispetto al codice attuale
- .gitignore: esclude i file di lock temporanei di Word
</commit_message>
<xml_diff>
--- a/ANALISI.docx
+++ b/ANALISI.docx
@@ -700,7 +700,22 @@
           <w:rFonts w:asciiTheme="majorHAnsi" w:hAnsiTheme="majorHAnsi" w:cstheme="majorHAnsi"/>
           <w:color w:val="000000" w:themeColor="text1"/>
         </w:rPr>
-        <w:t xml:space="preserve"> AND inviato = false. Solo il processo che ottiene esito positivo dalla query prende in carico l'invio della notifica.   Gestione degli errori SMTP (Gmail)</w:t>
+        <w:t xml:space="preserve"> AND inviato = false. Solo il processo che ottiene esito positivo dalla query prende in carico l'invio della notifica.   Notifica anticipata per fascia di prezzo e notifica di vendita</w:t>
+      </w:r>
+    </w:p>
+    <w:p>
+      <w:pPr>
+        <w:rPr>
+          <w:rFonts w:asciiTheme="majorHAnsi" w:hAnsiTheme="majorHAnsi" w:cstheme="majorHAnsi"/>
+          <w:color w:val="000000" w:themeColor="text1"/>
+        </w:rPr>
+      </w:pPr>
+      <w:r>
+        <w:rPr>
+          <w:rFonts w:asciiTheme="majorHAnsi" w:hAnsiTheme="majorHAnsi" w:cstheme="majorHAnsi"/>
+          <w:color w:val="000000" w:themeColor="text1"/>
+        </w:rPr>
+        <w:t xml:space="preserve">Oltre alla soglia esatta, un avviso scatta anche appena il prezzo entra nella fascia di mille che contiene la soglia scelta (esempio: soglia 4500 -&gt; fascia 4000-4999, notifica “ci siamo quasi” appena il prezzo scende sotto 5000). La fascia è calcolata al volo in SQL con FLOOR(soglia / 1000) * 1000 + 1000 ed è fissa rispetto alla soglia, non al prezzo di partenza dell'auto: non si ricalcola se il prezzo attraversa più fasce in discesa. Le due notifiche, fascia e soglia esatta, sono indipendenti e possono arrivare entrambe per lo stesso avviso.   Un terzo traguardo, anch'esso indipendente, è la vendita dell'auto: quando l'amministratore la segna come VENDUTA, AutoService pubblica un evento AutoVendutaEvent che avvisa chiunque abbia ancora un avviso di prezzo attivo su quell'auto, così non resta in attesa di un ribasso che non arriverà più. Ciascuno dei tre traguardi ha il proprio segno “già inviato” sul record dell'avviso (inviato, fasciaInviata, vendutaInviata), impostato con lo stesso aggiornamento atomico condizionato descritto sopra: nessuno dei tre può scattare due volte.   Gestione degli errori SMTP (Gmail)</w:t>
       </w:r>
     </w:p>
     <w:p>
@@ -731,23 +746,7 @@
           <w:rFonts w:asciiTheme="majorHAnsi" w:hAnsiTheme="majorHAnsi" w:cstheme="majorHAnsi"/>
           <w:color w:val="000000" w:themeColor="text1"/>
         </w:rPr>
-        <w:t xml:space="preserve">, riportando il record dell'avviso </w:t>
-      </w:r>
-      <w:proofErr w:type="gramStart"/>
-      <w:r>
-        <w:rPr>
-          <w:rFonts w:asciiTheme="majorHAnsi" w:hAnsiTheme="majorHAnsi" w:cstheme="majorHAnsi"/>
-          <w:color w:val="000000" w:themeColor="text1"/>
-        </w:rPr>
-        <w:t>a</w:t>
-      </w:r>
-      <w:proofErr w:type="gramEnd"/>
-      <w:r>
-        <w:rPr>
-          <w:rFonts w:asciiTheme="majorHAnsi" w:hAnsiTheme="majorHAnsi" w:cstheme="majorHAnsi"/>
-          <w:color w:val="000000" w:themeColor="text1"/>
-        </w:rPr>
-        <w:t xml:space="preserve"> inviato = false. Tra il rischiare di perdere </w:t>
+        <w:t xml:space="preserve">, riportando il record dell'avviso al suo stato precedente per quel traguardo specifico (inviato, fasciaInviata o vendutaInviata torna a false, a seconda di quale delle tre notifiche ha fallito). Tra il rischiare di perdere </w:t>
       </w:r>
       <w:r>
         <w:rPr>
@@ -1072,7 +1071,22 @@
           <w:rFonts w:asciiTheme="majorHAnsi" w:hAnsiTheme="majorHAnsi" w:cstheme="majorHAnsi"/>
           <w:color w:val="000000" w:themeColor="text1"/>
         </w:rPr>
-        <w:t xml:space="preserve"> per garantire la persistenza della sessione. Tramite l'endpoint DELETE /api/user/me l'utente può cancellare il proprio account, eliminando contestualmente dal database tutti i preferiti, gli avvisi e le sessioni collegate (diritto all'oblio).   </w:t>
+        <w:t xml:space="preserve"> per garantire la persistenza della sessione. Tramite l'endpoint DELETE /api/user/me l'utente può cancellare il proprio account, eliminando contestualmente dal database tutti i preferiti, gli avvisi e le sessioni collegate (diritto all'oblio).   Scelta di una lista di marche curata invece di un'API esterna</w:t>
+      </w:r>
+    </w:p>
+    <w:p>
+      <w:pPr>
+        <w:rPr>
+          <w:rFonts w:asciiTheme="majorHAnsi" w:hAnsiTheme="majorHAnsi" w:cstheme="majorHAnsi"/>
+          <w:color w:val="000000" w:themeColor="text1"/>
+        </w:rPr>
+      </w:pPr>
+      <w:r>
+        <w:rPr>
+          <w:rFonts w:asciiTheme="majorHAnsi" w:hAnsiTheme="majorHAnsi" w:cstheme="majorHAnsi"/>
+          <w:color w:val="000000" w:themeColor="text1"/>
+        </w:rPr>
+        <w:t xml:space="preserve">Per la creazione di una nuova marca da parte dell'amministratore era stata valutata l'idea di appoggiarsi a un'API esterna con l'elenco completo delle marche automobilistiche esistenti, sul modello di quanto già tentato per le foto delle auto. Sono stati verificati diversi servizi, tra cui il registro NHTSA vPIC: l'endpoint filtrato sui soli veicoli di tipo “car” restituisce un elenco gratuito e senza chiave, ma è un registro di immatricolazioni statunitense, non una lista di marche mondiale. Mancano marche europee di uso comune come Škoda, SEAT, Citroën, Land Rover e Jeep, mentre compaiono decine di voci irrilevanti per un salone (piccoli produttori di kit-car, carrozzerie artigianali americane, veicoli storici).   Per questo si è scelto di non introdurre una dipendenza da un servizio esterno, con il relativo rischio di quote, chiavi o che il servizio smetta di funzionare (già incontrato con le API di immagini valutate per il progetto), e di affiancare all'inserimento libero della marca un elenco statico e curato di circa settanta marche note (fe/src/lib/marcheNote.js), usato solo come suggerimento nel campo di inserimento tramite un datalist HTML: il campo resta di testo libero, così l'amministratore può sempre scrivere una marca non presente in elenco, utile per quando ne esce una nuova sul mercato.   </w:t>
       </w:r>
     </w:p>
     <w:p>
@@ -1110,315 +1124,49 @@
           <w:rFonts w:asciiTheme="majorHAnsi" w:hAnsiTheme="majorHAnsi" w:cstheme="majorHAnsi"/>
           <w:color w:val="000000" w:themeColor="text1"/>
         </w:rPr>
-        <w:t xml:space="preserve">Il database </w:t>
-      </w:r>
-      <w:proofErr w:type="spellStart"/>
-      <w:r>
-        <w:rPr>
-          <w:rFonts w:asciiTheme="majorHAnsi" w:hAnsiTheme="majorHAnsi" w:cstheme="majorHAnsi"/>
-          <w:color w:val="000000" w:themeColor="text1"/>
-        </w:rPr>
-        <w:t>PostgreSQL</w:t>
-      </w:r>
-      <w:proofErr w:type="spellEnd"/>
-      <w:r>
-        <w:rPr>
-          <w:rFonts w:asciiTheme="majorHAnsi" w:hAnsiTheme="majorHAnsi" w:cstheme="majorHAnsi"/>
-          <w:color w:val="000000" w:themeColor="text1"/>
-        </w:rPr>
-        <w:t xml:space="preserve"> si basa su poche tabelle </w:t>
-      </w:r>
-      <w:proofErr w:type="gramStart"/>
-      <w:r>
-        <w:rPr>
-          <w:rFonts w:asciiTheme="majorHAnsi" w:hAnsiTheme="majorHAnsi" w:cstheme="majorHAnsi"/>
-          <w:color w:val="000000" w:themeColor="text1"/>
-        </w:rPr>
-        <w:t xml:space="preserve">collegate:   </w:t>
-      </w:r>
-      <w:proofErr w:type="gramEnd"/>
-      <w:r>
-        <w:rPr>
-          <w:rFonts w:asciiTheme="majorHAnsi" w:hAnsiTheme="majorHAnsi" w:cstheme="majorHAnsi"/>
-          <w:color w:val="000000" w:themeColor="text1"/>
-        </w:rPr>
-        <w:t xml:space="preserve">Utente: id, </w:t>
-      </w:r>
-      <w:proofErr w:type="gramStart"/>
-      <w:r>
-        <w:rPr>
-          <w:rFonts w:asciiTheme="majorHAnsi" w:hAnsiTheme="majorHAnsi" w:cstheme="majorHAnsi"/>
-          <w:color w:val="000000" w:themeColor="text1"/>
-        </w:rPr>
-        <w:t>email</w:t>
-      </w:r>
-      <w:proofErr w:type="gramEnd"/>
-      <w:r>
-        <w:rPr>
-          <w:rFonts w:asciiTheme="majorHAnsi" w:hAnsiTheme="majorHAnsi" w:cstheme="majorHAnsi"/>
-          <w:color w:val="000000" w:themeColor="text1"/>
-        </w:rPr>
-        <w:t xml:space="preserve"> (univoca), nome, password (</w:t>
-      </w:r>
-      <w:proofErr w:type="spellStart"/>
-      <w:r>
-        <w:rPr>
-          <w:rFonts w:asciiTheme="majorHAnsi" w:hAnsiTheme="majorHAnsi" w:cstheme="majorHAnsi"/>
-          <w:color w:val="000000" w:themeColor="text1"/>
-        </w:rPr>
-        <w:t>hashata</w:t>
-      </w:r>
-      <w:proofErr w:type="spellEnd"/>
-      <w:r>
-        <w:rPr>
-          <w:rFonts w:asciiTheme="majorHAnsi" w:hAnsiTheme="majorHAnsi" w:cstheme="majorHAnsi"/>
-          <w:color w:val="000000" w:themeColor="text1"/>
-        </w:rPr>
-        <w:t xml:space="preserve">), ruolo (USER o ADMIN), </w:t>
-      </w:r>
-      <w:proofErr w:type="spellStart"/>
-      <w:r>
-        <w:rPr>
-          <w:rFonts w:asciiTheme="majorHAnsi" w:hAnsiTheme="majorHAnsi" w:cstheme="majorHAnsi"/>
-          <w:color w:val="000000" w:themeColor="text1"/>
-        </w:rPr>
-        <w:t>createdAt</w:t>
-      </w:r>
-      <w:proofErr w:type="spellEnd"/>
-      <w:r>
-        <w:rPr>
-          <w:rFonts w:asciiTheme="majorHAnsi" w:hAnsiTheme="majorHAnsi" w:cstheme="majorHAnsi"/>
-          <w:color w:val="000000" w:themeColor="text1"/>
-        </w:rPr>
-        <w:t xml:space="preserve">.   Marca: id, nome (univoco).   Auto: id, modello, </w:t>
-      </w:r>
-      <w:proofErr w:type="spellStart"/>
-      <w:r>
-        <w:rPr>
-          <w:rFonts w:asciiTheme="majorHAnsi" w:hAnsiTheme="majorHAnsi" w:cstheme="majorHAnsi"/>
-          <w:color w:val="000000" w:themeColor="text1"/>
-        </w:rPr>
-        <w:t>marca_id</w:t>
-      </w:r>
-      <w:proofErr w:type="spellEnd"/>
-      <w:r>
-        <w:rPr>
-          <w:rFonts w:asciiTheme="majorHAnsi" w:hAnsiTheme="majorHAnsi" w:cstheme="majorHAnsi"/>
-          <w:color w:val="000000" w:themeColor="text1"/>
-        </w:rPr>
-        <w:t xml:space="preserve"> (FK su Marca), prezzo, </w:t>
-      </w:r>
-      <w:proofErr w:type="spellStart"/>
-      <w:r>
-        <w:rPr>
-          <w:rFonts w:asciiTheme="majorHAnsi" w:hAnsiTheme="majorHAnsi" w:cstheme="majorHAnsi"/>
-          <w:color w:val="000000" w:themeColor="text1"/>
-        </w:rPr>
-        <w:t>prezzoAcquisto</w:t>
-      </w:r>
-      <w:proofErr w:type="spellEnd"/>
-      <w:r>
-        <w:rPr>
-          <w:rFonts w:asciiTheme="majorHAnsi" w:hAnsiTheme="majorHAnsi" w:cstheme="majorHAnsi"/>
-          <w:color w:val="000000" w:themeColor="text1"/>
-        </w:rPr>
-        <w:t xml:space="preserve"> (visibile solo all'Admin), </w:t>
-      </w:r>
-      <w:proofErr w:type="spellStart"/>
-      <w:proofErr w:type="gramStart"/>
-      <w:r>
-        <w:rPr>
-          <w:rFonts w:asciiTheme="majorHAnsi" w:hAnsiTheme="majorHAnsi" w:cstheme="majorHAnsi"/>
-          <w:color w:val="000000" w:themeColor="text1"/>
-        </w:rPr>
-        <w:t>annoImmatricolazione</w:t>
-      </w:r>
-      <w:proofErr w:type="spellEnd"/>
-      <w:proofErr w:type="gramEnd"/>
-      <w:r>
-        <w:rPr>
-          <w:rFonts w:asciiTheme="majorHAnsi" w:hAnsiTheme="majorHAnsi" w:cstheme="majorHAnsi"/>
-          <w:color w:val="000000" w:themeColor="text1"/>
-        </w:rPr>
-        <w:t xml:space="preserve">, chilometraggio, alimentazione, bozza (booleano), descrizione, </w:t>
-      </w:r>
-      <w:proofErr w:type="spellStart"/>
-      <w:r>
-        <w:rPr>
-          <w:rFonts w:asciiTheme="majorHAnsi" w:hAnsiTheme="majorHAnsi" w:cstheme="majorHAnsi"/>
-          <w:color w:val="000000" w:themeColor="text1"/>
-        </w:rPr>
-        <w:t>createdAt</w:t>
-      </w:r>
-      <w:proofErr w:type="spellEnd"/>
-      <w:r>
-        <w:rPr>
-          <w:rFonts w:asciiTheme="majorHAnsi" w:hAnsiTheme="majorHAnsi" w:cstheme="majorHAnsi"/>
-          <w:color w:val="000000" w:themeColor="text1"/>
-        </w:rPr>
-        <w:t xml:space="preserve">.   Preferito: id, </w:t>
-      </w:r>
-      <w:proofErr w:type="spellStart"/>
-      <w:r>
-        <w:rPr>
-          <w:rFonts w:asciiTheme="majorHAnsi" w:hAnsiTheme="majorHAnsi" w:cstheme="majorHAnsi"/>
-          <w:color w:val="000000" w:themeColor="text1"/>
-        </w:rPr>
-        <w:t>utente_id</w:t>
-      </w:r>
-      <w:proofErr w:type="spellEnd"/>
-      <w:r>
-        <w:rPr>
-          <w:rFonts w:asciiTheme="majorHAnsi" w:hAnsiTheme="majorHAnsi" w:cstheme="majorHAnsi"/>
-          <w:color w:val="000000" w:themeColor="text1"/>
-        </w:rPr>
-        <w:t xml:space="preserve"> (FK su Utente), </w:t>
-      </w:r>
-      <w:proofErr w:type="spellStart"/>
-      <w:r>
-        <w:rPr>
-          <w:rFonts w:asciiTheme="majorHAnsi" w:hAnsiTheme="majorHAnsi" w:cstheme="majorHAnsi"/>
-          <w:color w:val="000000" w:themeColor="text1"/>
-        </w:rPr>
-        <w:t>auto_id</w:t>
-      </w:r>
-      <w:proofErr w:type="spellEnd"/>
-      <w:r>
-        <w:rPr>
-          <w:rFonts w:asciiTheme="majorHAnsi" w:hAnsiTheme="majorHAnsi" w:cstheme="majorHAnsi"/>
-          <w:color w:val="000000" w:themeColor="text1"/>
-        </w:rPr>
-        <w:t xml:space="preserve"> (FK su Auto).   Avviso: id, </w:t>
-      </w:r>
-      <w:proofErr w:type="spellStart"/>
-      <w:r>
-        <w:rPr>
-          <w:rFonts w:asciiTheme="majorHAnsi" w:hAnsiTheme="majorHAnsi" w:cstheme="majorHAnsi"/>
-          <w:color w:val="000000" w:themeColor="text1"/>
-        </w:rPr>
-        <w:t>utente_id</w:t>
-      </w:r>
-      <w:proofErr w:type="spellEnd"/>
-      <w:r>
-        <w:rPr>
-          <w:rFonts w:asciiTheme="majorHAnsi" w:hAnsiTheme="majorHAnsi" w:cstheme="majorHAnsi"/>
-          <w:color w:val="000000" w:themeColor="text1"/>
-        </w:rPr>
-        <w:t xml:space="preserve"> (FK su Utente), </w:t>
-      </w:r>
-      <w:proofErr w:type="spellStart"/>
-      <w:r>
-        <w:rPr>
-          <w:rFonts w:asciiTheme="majorHAnsi" w:hAnsiTheme="majorHAnsi" w:cstheme="majorHAnsi"/>
-          <w:color w:val="000000" w:themeColor="text1"/>
-        </w:rPr>
-        <w:t>auto_id</w:t>
-      </w:r>
-      <w:proofErr w:type="spellEnd"/>
-      <w:r>
-        <w:rPr>
-          <w:rFonts w:asciiTheme="majorHAnsi" w:hAnsiTheme="majorHAnsi" w:cstheme="majorHAnsi"/>
-          <w:color w:val="000000" w:themeColor="text1"/>
-        </w:rPr>
-        <w:t xml:space="preserve"> (FK su Auto), </w:t>
-      </w:r>
-      <w:proofErr w:type="spellStart"/>
-      <w:proofErr w:type="gramStart"/>
-      <w:r>
-        <w:rPr>
-          <w:rFonts w:asciiTheme="majorHAnsi" w:hAnsiTheme="majorHAnsi" w:cstheme="majorHAnsi"/>
-          <w:color w:val="000000" w:themeColor="text1"/>
-        </w:rPr>
-        <w:t>sogliaPrezzo</w:t>
-      </w:r>
-      <w:proofErr w:type="spellEnd"/>
-      <w:proofErr w:type="gramEnd"/>
-      <w:r>
-        <w:rPr>
-          <w:rFonts w:asciiTheme="majorHAnsi" w:hAnsiTheme="majorHAnsi" w:cstheme="majorHAnsi"/>
-          <w:color w:val="000000" w:themeColor="text1"/>
-        </w:rPr>
-        <w:t xml:space="preserve">, inviato (booleano), </w:t>
-      </w:r>
-      <w:proofErr w:type="spellStart"/>
-      <w:r>
-        <w:rPr>
-          <w:rFonts w:asciiTheme="majorHAnsi" w:hAnsiTheme="majorHAnsi" w:cstheme="majorHAnsi"/>
-          <w:color w:val="000000" w:themeColor="text1"/>
-        </w:rPr>
-        <w:t>tokenDisattivazione</w:t>
-      </w:r>
-      <w:proofErr w:type="spellEnd"/>
-      <w:r>
-        <w:rPr>
-          <w:rFonts w:asciiTheme="majorHAnsi" w:hAnsiTheme="majorHAnsi" w:cstheme="majorHAnsi"/>
-          <w:color w:val="000000" w:themeColor="text1"/>
-        </w:rPr>
-        <w:t xml:space="preserve"> (</w:t>
-      </w:r>
-      <w:proofErr w:type="spellStart"/>
-      <w:r>
-        <w:rPr>
-          <w:rFonts w:asciiTheme="majorHAnsi" w:hAnsiTheme="majorHAnsi" w:cstheme="majorHAnsi"/>
-          <w:color w:val="000000" w:themeColor="text1"/>
-        </w:rPr>
-        <w:t>hash</w:t>
-      </w:r>
-      <w:proofErr w:type="spellEnd"/>
-      <w:r>
-        <w:rPr>
-          <w:rFonts w:asciiTheme="majorHAnsi" w:hAnsiTheme="majorHAnsi" w:cstheme="majorHAnsi"/>
-          <w:color w:val="000000" w:themeColor="text1"/>
-        </w:rPr>
-        <w:t xml:space="preserve"> del token monouso).   </w:t>
-      </w:r>
-      <w:proofErr w:type="spellStart"/>
-      <w:r>
-        <w:rPr>
-          <w:rFonts w:asciiTheme="majorHAnsi" w:hAnsiTheme="majorHAnsi" w:cstheme="majorHAnsi"/>
-          <w:color w:val="000000" w:themeColor="text1"/>
-        </w:rPr>
-        <w:t>SessioneRevocata</w:t>
-      </w:r>
-      <w:proofErr w:type="spellEnd"/>
-      <w:r>
-        <w:rPr>
-          <w:rFonts w:asciiTheme="majorHAnsi" w:hAnsiTheme="majorHAnsi" w:cstheme="majorHAnsi"/>
-          <w:color w:val="000000" w:themeColor="text1"/>
-        </w:rPr>
-        <w:t xml:space="preserve">: id, </w:t>
-      </w:r>
-      <w:proofErr w:type="spellStart"/>
-      <w:r>
-        <w:rPr>
-          <w:rFonts w:asciiTheme="majorHAnsi" w:hAnsiTheme="majorHAnsi" w:cstheme="majorHAnsi"/>
-          <w:color w:val="000000" w:themeColor="text1"/>
-        </w:rPr>
-        <w:t>tokenHash</w:t>
-      </w:r>
-      <w:proofErr w:type="spellEnd"/>
-      <w:r>
-        <w:rPr>
-          <w:rFonts w:asciiTheme="majorHAnsi" w:hAnsiTheme="majorHAnsi" w:cstheme="majorHAnsi"/>
-          <w:color w:val="000000" w:themeColor="text1"/>
-        </w:rPr>
-        <w:t xml:space="preserve">, </w:t>
-      </w:r>
-      <w:proofErr w:type="spellStart"/>
-      <w:r>
-        <w:rPr>
-          <w:rFonts w:asciiTheme="majorHAnsi" w:hAnsiTheme="majorHAnsi" w:cstheme="majorHAnsi"/>
-          <w:color w:val="000000" w:themeColor="text1"/>
-        </w:rPr>
-        <w:t>istanteRevoca</w:t>
-      </w:r>
-      <w:proofErr w:type="spellEnd"/>
-      <w:r>
-        <w:rPr>
-          <w:rFonts w:asciiTheme="majorHAnsi" w:hAnsiTheme="majorHAnsi" w:cstheme="majorHAnsi"/>
-          <w:color w:val="000000" w:themeColor="text1"/>
-        </w:rPr>
-        <w:t xml:space="preserve">.   </w:t>
+        <w:t xml:space="preserve">Il database PostgreSQL si basa su poche tabelle collegate:   </w:t>
+      </w:r>
+      <w:r>
+        <w:rPr>
+          <w:rFonts w:asciiTheme="majorHAnsi" w:hAnsiTheme="majorHAnsi" w:cstheme="majorHAnsi"/>
+          <w:color w:val="000000" w:themeColor="text1"/>
+        </w:rPr>
+        <w:t xml:space="preserve">Utente: id, email (univoca), nome, cognome, password (hashata), createdAt; i ruoli (USER, ADMIN) sono collegati tramite una tabella ponte RuoloUtente verso una tabella Ruolo, per permettere in astratto piu' di un ruolo per utente.   </w:t>
+      </w:r>
+      <w:r>
+        <w:rPr>
+          <w:rFonts w:asciiTheme="majorHAnsi" w:hAnsiTheme="majorHAnsi" w:cstheme="majorHAnsi"/>
+          <w:color w:val="000000" w:themeColor="text1"/>
+        </w:rPr>
+        <w:t xml:space="preserve">Marca: id, nome (univoco).   </w:t>
+      </w:r>
+      <w:r>
+        <w:rPr>
+          <w:rFonts w:asciiTheme="majorHAnsi" w:hAnsiTheme="majorHAnsi" w:cstheme="majorHAnsi"/>
+          <w:color w:val="000000" w:themeColor="text1"/>
+        </w:rPr>
+        <w:t xml:space="preserve">Auto: id, telaio (numero di telaio, univoco), modello, marca_id (FK su Marca), prezzo, prezzoAcquisto (visibile solo all'Admin), annoImmatricolazione, chilometraggio, alimentazione, cilindrata, potenza, stato (enum BOZZA, NUOVO, DISPONIBILE, VENDUTA: sostituisce il precedente booleano bozza), descrizione, path (percorso dell'immagine), createdAt.   </w:t>
+      </w:r>
+      <w:r>
+        <w:rPr>
+          <w:rFonts w:asciiTheme="majorHAnsi" w:hAnsiTheme="majorHAnsi" w:cstheme="majorHAnsi"/>
+          <w:color w:val="000000" w:themeColor="text1"/>
+        </w:rPr>
+        <w:t xml:space="preserve">Preferito: id, utente_id (FK su Utente), auto_id (FK su Auto), createdAt.   </w:t>
+      </w:r>
+      <w:r>
+        <w:rPr>
+          <w:rFonts w:asciiTheme="majorHAnsi" w:hAnsiTheme="majorHAnsi" w:cstheme="majorHAnsi"/>
+          <w:color w:val="000000" w:themeColor="text1"/>
+        </w:rPr>
+        <w:t xml:space="preserve">Avviso: id, utente_id (FK su Utente), auto_id (FK su Auto), soglia, inviato / fasciaInviata / vendutaInviata (booleani, uno per ciascun traguardo indipendente), attivo (booleano, false dopo la disattivazione), tokenDisattivazione (hash del token monouso), createdAt.   </w:t>
+      </w:r>
+      <w:r>
+        <w:rPr>
+          <w:rFonts w:asciiTheme="majorHAnsi" w:hAnsiTheme="majorHAnsi" w:cstheme="majorHAnsi"/>
+          <w:color w:val="000000" w:themeColor="text1"/>
+        </w:rPr>
+        <w:t xml:space="preserve">TokenJwt: id, utente_id (FK su Utente), token (hash), createdAt, expiresAt, revocato (booleano): tiene traccia dei token emessi, non solo di quelli revocati, per poterli validare e invalidare su logout o refresh.   </w:t>
       </w:r>
     </w:p>
     <w:p>

</xml_diff>

<commit_message>
Aggiunta upload file immagine per ogni auto.
</commit_message>
<xml_diff>
--- a/ANALISI.docx
+++ b/ANALISI.docx
@@ -1086,7 +1086,22 @@
           <w:rFonts w:asciiTheme="majorHAnsi" w:hAnsiTheme="majorHAnsi" w:cstheme="majorHAnsi"/>
           <w:color w:val="000000" w:themeColor="text1"/>
         </w:rPr>
-        <w:t xml:space="preserve">Per la creazione di una nuova marca da parte dell'amministratore era stata valutata l'idea di appoggiarsi a un'API esterna con l'elenco completo delle marche automobilistiche esistenti, sul modello di quanto già tentato per le foto delle auto. Sono stati verificati diversi servizi, tra cui il registro NHTSA vPIC: l'endpoint filtrato sui soli veicoli di tipo “car” restituisce un elenco gratuito e senza chiave, ma è un registro di immatricolazioni statunitense, non una lista di marche mondiale. Mancano marche europee di uso comune come Škoda, SEAT, Citroën, Land Rover e Jeep, mentre compaiono decine di voci irrilevanti per un salone (piccoli produttori di kit-car, carrozzerie artigianali americane, veicoli storici).   Per questo si è scelto di non introdurre una dipendenza da un servizio esterno, con il relativo rischio di quote, chiavi o che il servizio smetta di funzionare (già incontrato con le API di immagini valutate per il progetto), e di affiancare all'inserimento libero della marca un elenco statico e curato di circa settanta marche note (fe/src/lib/marcheNote.js), usato solo come suggerimento nel campo di inserimento tramite un datalist HTML: il campo resta di testo libero, così l'amministratore può sempre scrivere una marca non presente in elenco, utile per quando ne esce una nuova sul mercato.   </w:t>
+        <w:t xml:space="preserve">Per la creazione di una nuova marca da parte dell'amministratore era stata valutata l'idea di appoggiarsi a un'API esterna con l'elenco completo delle marche automobilistiche esistenti, sul modello di quanto già tentato per le foto delle auto. Sono stati verificati diversi servizi, tra cui il registro NHTSA vPIC: l'endpoint filtrato sui soli veicoli di tipo “car” restituisce un elenco gratuito e senza chiave, ma è un registro di immatricolazioni statunitense, non una lista di marche mondiale. Mancano marche europee di uso comune come Škoda, SEAT, Citroën, Land Rover e Jeep, mentre compaiono decine di voci irrilevanti per un salone (piccoli produttori di kit-car, carrozzerie artigianali americane, veicoli storici).   Per questo si è scelto di non introdurre una dipendenza da un servizio esterno, con il relativo rischio di quote, chiavi o che il servizio smetta di funzionare (già incontrato con le API di immagini valutate per il progetto), e di affiancare all'inserimento libero della marca un elenco statico e curato di circa settanta marche note (fe/src/lib/marcheNote.js), usato solo come suggerimento nel campo di inserimento tramite un datalist HTML: il campo resta di testo libero, così l'amministratore può sempre scrivere una marca non presente in elenco, utile per quando ne esce una nuova sul mercato.   Foto dell'auto salvata nel database, non su disco</w:t>
+      </w:r>
+    </w:p>
+    <w:p>
+      <w:pPr>
+        <w:rPr>
+          <w:rFonts w:asciiTheme="majorHAnsi" w:hAnsiTheme="majorHAnsi" w:cstheme="majorHAnsi"/>
+          <w:color w:val="000000" w:themeColor="text1"/>
+        </w:rPr>
+      </w:pPr>
+      <w:r>
+        <w:rPr>
+          <w:rFonts w:asciiTheme="majorHAnsi" w:hAnsiTheme="majorHAnsi" w:cstheme="majorHAnsi"/>
+          <w:color w:val="000000" w:themeColor="text1"/>
+        </w:rPr>
+        <w:t xml:space="preserve">L'amministratore puo' caricare una foto vera dell'auto (PNG, JPEG o WEBP, fino a 30MB) tramite POST /api/auto/{id}/foto. Il formato si riconosce dai byte veri del file (i primi byte, o “magic number”: es. 0x89 PNG per un PNG), non dal Content-Type dichiarato dal client, che e' deciso dal browser e si puo' falsificare. La foto e' salvata come bytea direttamente nel database, non su disco: su Render il filesystem del container e' effimero e viene ricreato a ogni deploy, quindi un file scritto su disco andrebbe perso al primo riavvio. Il database invece persiste, e questa scelta non introduce ne' un servizio di storage esterno ne' un disco a pagamento. Se l'amministratore non carica nulla, il catalogo mostra comunque una foto generica del modello cercata in automatico (vedi sopra); appena una foto vera viene caricata, ha sempre la precedenza.   </w:t>
       </w:r>
     </w:p>
     <w:p>
@@ -1145,7 +1160,7 @@
           <w:rFonts w:asciiTheme="majorHAnsi" w:hAnsiTheme="majorHAnsi" w:cstheme="majorHAnsi"/>
           <w:color w:val="000000" w:themeColor="text1"/>
         </w:rPr>
-        <w:t xml:space="preserve">Auto: id, telaio (numero di telaio, univoco), modello, marca_id (FK su Marca), prezzo, prezzoAcquisto (visibile solo all'Admin), annoImmatricolazione, chilometraggio, alimentazione, cilindrata, potenza, stato (enum BOZZA, NUOVO, DISPONIBILE, VENDUTA: sostituisce il precedente booleano bozza), descrizione, path (percorso dell'immagine), createdAt.   </w:t>
+        <w:t xml:space="preserve">Auto: id, telaio (numero di telaio, univoco), modello, marca_id (FK su Marca), prezzo, prezzoAcquisto (visibile solo all'Admin), annoImmatricolazione, chilometraggio, alimentazione, cilindrata, potenza, stato (enum BOZZA, NUOVO, DISPONIBILE, VENDUTA: sostituisce il precedente booleano bozza), descrizione, foto e fotoContentType (bytea + tipo MIME, NULL se non ancora caricata), createdAt.   </w:t>
       </w:r>
       <w:r>
         <w:rPr>

</xml_diff>